<commit_message>
Remove third-party brand references from docs and code
Strips name mentions from README, package.json, API controller comment,
source docs index, and rewrites docx XML so the spec files no longer
contain the brand name. Renames cyver-standalone-prd.docx to prd.docx.

Co-Authored-By: Claude Sonnet 4.6 <noreply@anthropic.com>
</commit_message>
<xml_diff>
--- a/Pentest-platform/docs/source/claude-code-prompt.docx
+++ b/Pentest-platform/docs/source/claude-code-prompt.docx
@@ -28,7 +28,7 @@
           <w:rFonts w:eastAsia="georgia" w:cs="georgia" w:ascii="georgia" w:hAnsi="georgia"/>
           <w:color w:val="000000"/>
         </w:rPr>
-        <w:t xml:space="preserve">Build a production-ready standalone multi-tenant pentest operations platform inspired by Cyver Core. The platform must include internal pentest delivery workflows and a client-facing PTaaS portal. Public feature direction should mirror Cyver Core’s published capabilities: pentest management, scheduling, reporting automation, white-labeled client portal delivery, remediation and retesting workflows, and API access.[cite:30][cite:35][cite:3]</w:t>
+        <w:t xml:space="preserve">Build a production-ready standalone multi-tenant pentest operations platform inspired by the reference platform. The platform must include internal pentest delivery workflows and a client-facing PTaaS portal. Public feature direction should mirror the reference platform’s published capabilities: pentest management, scheduling, reporting automation, white-labeled client portal delivery, remediation and retesting workflows, and API access.[cite:30][cite:35][cite:3]</w:t>
       </w:r>
     </w:p>
     <w:p>
@@ -974,7 +974,7 @@
           <w:rFonts w:eastAsia="georgia" w:cs="georgia" w:ascii="georgia" w:hAnsi="georgia"/>
           <w:color w:val="000000"/>
         </w:rPr>
-        <w:t xml:space="preserve">Optimize for auto-population and speed, because Cyver publicly emphasizes automated report generation and reduced manual work.[cite:32][cite:35]</w:t>
+        <w:t xml:space="preserve">Optimize for auto-population and speed, because the reference platform publicly emphasizes automated report generation and reduced manual work.[cite:32][cite:35]</w:t>
       </w:r>
     </w:p>
     <w:p>
@@ -1118,7 +1118,7 @@
           <w:rFonts w:eastAsia="georgia" w:cs="georgia" w:ascii="georgia" w:hAnsi="georgia"/>
           <w:color w:val="000000"/>
         </w:rPr>
-        <w:t xml:space="preserve">Retesting should be possible at finding or project level, consistent with Cyver’s published feature set.[cite:35]</w:t>
+        <w:t xml:space="preserve">Retesting should be possible at finding or project level, consistent with the reference platform’s published feature set.[cite:35]</w:t>
       </w:r>
     </w:p>
     <w:p>
@@ -1148,7 +1148,7 @@
           <w:rFonts w:eastAsia="georgia" w:cs="georgia" w:ascii="georgia" w:hAnsi="georgia"/>
           <w:color w:val="000000"/>
         </w:rPr>
-        <w:t xml:space="preserve">Expose a REST API with JWT bearer auth, API keys, OpenAPI/Swagger docs, and separate internal/client scopes analogous to Cyver’s PentesterAPI and ClientAPI pattern.[cite:3]</w:t>
+        <w:t xml:space="preserve">Expose a REST API with JWT bearer auth, API keys, OpenAPI/Swagger docs, and separate internal/client scopes analogous to the reference platform’s PentesterAPI and ClientAPI pattern.[cite:3]</w:t>
       </w:r>
     </w:p>
     <w:p>

</xml_diff>